<commit_message>
Restore April's no-spend table
Co-Authored-By: Claude Opus 5.5 <noreply@anthropic.com>
Claude-Session: https://claude.ai/code/session_01AjVrAcexsQqCzU6sYAjzCX
</commit_message>
<xml_diff>
--- a/Paid_Media_Review_Apr-Sep_2026.docx
+++ b/Paid_Media_Review_Apr-Sep_2026.docx
@@ -18157,6 +18157,449 @@
     </w:p>
     <w:p>
       <w:pPr>
+        <w:pStyle w:val="Heading2"/>
+        <w:keepNext/>
+      </w:pPr>
+      <w:r>
+        <w:rPr/>
+        <w:t xml:space="preserve">Not ranked: no spend attributed</w:t>
+      </w:r>
+    </w:p>
+    <w:tbl>
+      <w:tblPr>
+        <w:tblW w:w="10080" w:type="dxa"/>
+        <w:tblBorders>
+          <w:top w:val="single" w:sz="4" w:color="BFBFBF"/>
+          <w:left w:val="single" w:sz="4" w:color="BFBFBF"/>
+          <w:bottom w:val="single" w:sz="4" w:color="BFBFBF"/>
+          <w:right w:val="single" w:sz="4" w:color="BFBFBF"/>
+          <w:insideH w:val="single" w:sz="4" w:color="BFBFBF"/>
+          <w:insideV w:val="single" w:sz="4" w:color="BFBFBF"/>
+        </w:tblBorders>
+        <w:tblLayout w:type="fixed"/>
+        <w:tblCellMar>
+          <w:top w:w="40" w:type="dxa"/>
+          <w:left w:w="80" w:type="dxa"/>
+          <w:bottom w:w="40" w:type="dxa"/>
+          <w:right w:w="80" w:type="dxa"/>
+        </w:tblCellMar>
+      </w:tblPr>
+      <w:tblGrid>
+        <w:gridCol w:w="4636"/>
+        <w:gridCol w:w="1814"/>
+        <w:gridCol w:w="1411"/>
+        <w:gridCol w:w="2219"/>
+      </w:tblGrid>
+      <w:tr>
+        <w:trPr>
+          <w:tblHeader/>
+          <w:cantSplit/>
+        </w:trPr>
+        <w:tc>
+          <w:tcPr>
+            <w:tcW w:w="4636" w:type="dxa"/>
+            <w:shd w:val="clear" w:color="auto" w:fill="D9E2F3"/>
+          </w:tcPr>
+          <w:p>
+            <w:pPr>
+              <w:spacing w:before="0" w:after="0"/>
+              <w:jc w:val="left"/>
+            </w:pPr>
+            <w:r>
+              <w:rPr>
+                <w:b/>
+                <w:sz w:val="17"/>
+                <w:szCs w:val="17"/>
+              </w:rPr>
+              <w:t xml:space="preserve">Row</w:t>
+            </w:r>
+          </w:p>
+        </w:tc>
+        <w:tc>
+          <w:tcPr>
+            <w:tcW w:w="1814" w:type="dxa"/>
+            <w:shd w:val="clear" w:color="auto" w:fill="D9E2F3"/>
+          </w:tcPr>
+          <w:p>
+            <w:pPr>
+              <w:spacing w:before="0" w:after="0"/>
+              <w:jc w:val="right"/>
+            </w:pPr>
+            <w:r>
+              <w:rPr>
+                <w:b/>
+                <w:sz w:val="17"/>
+                <w:szCs w:val="17"/>
+              </w:rPr>
+              <w:t xml:space="preserve">Spend</w:t>
+            </w:r>
+          </w:p>
+        </w:tc>
+        <w:tc>
+          <w:tcPr>
+            <w:tcW w:w="1411" w:type="dxa"/>
+            <w:shd w:val="clear" w:color="auto" w:fill="D9E2F3"/>
+          </w:tcPr>
+          <w:p>
+            <w:pPr>
+              <w:spacing w:before="0" w:after="0"/>
+              <w:jc w:val="right"/>
+            </w:pPr>
+            <w:r>
+              <w:rPr>
+                <w:b/>
+                <w:sz w:val="17"/>
+                <w:szCs w:val="17"/>
+              </w:rPr>
+              <w:t xml:space="preserve">Leads</w:t>
+            </w:r>
+          </w:p>
+        </w:tc>
+        <w:tc>
+          <w:tcPr>
+            <w:tcW w:w="2219" w:type="dxa"/>
+            <w:shd w:val="clear" w:color="auto" w:fill="D9E2F3"/>
+          </w:tcPr>
+          <w:p>
+            <w:pPr>
+              <w:spacing w:before="0" w:after="0"/>
+              <w:jc w:val="right"/>
+            </w:pPr>
+            <w:r>
+              <w:rPr>
+                <w:b/>
+                <w:sz w:val="17"/>
+                <w:szCs w:val="17"/>
+              </w:rPr>
+              <w:t xml:space="preserve">Revenue</w:t>
+            </w:r>
+          </w:p>
+        </w:tc>
+      </w:tr>
+      <w:tr>
+        <w:trPr>
+          <w:cantSplit/>
+        </w:trPr>
+        <w:tc>
+          <w:tcPr>
+            <w:tcW w:w="4636" w:type="dxa"/>
+          </w:tcPr>
+          <w:p>
+            <w:pPr>
+              <w:spacing w:before="0" w:after="0"/>
+              <w:jc w:val="left"/>
+            </w:pPr>
+            <w:r>
+              <w:rPr>
+                <w:sz w:val="17"/>
+                <w:szCs w:val="17"/>
+              </w:rPr>
+              <w:t xml:space="preserve">PPC HVAC</w:t>
+            </w:r>
+          </w:p>
+        </w:tc>
+        <w:tc>
+          <w:tcPr>
+            <w:tcW w:w="1814" w:type="dxa"/>
+          </w:tcPr>
+          <w:p>
+            <w:pPr>
+              <w:spacing w:before="0" w:after="0"/>
+              <w:jc w:val="right"/>
+            </w:pPr>
+            <w:r>
+              <w:rPr>
+                <w:sz w:val="17"/>
+                <w:szCs w:val="17"/>
+              </w:rPr>
+              <w:t xml:space="preserve">$0.00</w:t>
+            </w:r>
+          </w:p>
+        </w:tc>
+        <w:tc>
+          <w:tcPr>
+            <w:tcW w:w="1411" w:type="dxa"/>
+          </w:tcPr>
+          <w:p>
+            <w:pPr>
+              <w:spacing w:before="0" w:after="0"/>
+              <w:jc w:val="right"/>
+            </w:pPr>
+            <w:r>
+              <w:rPr>
+                <w:sz w:val="17"/>
+                <w:szCs w:val="17"/>
+              </w:rPr>
+              <w:t xml:space="preserve">13</w:t>
+            </w:r>
+          </w:p>
+        </w:tc>
+        <w:tc>
+          <w:tcPr>
+            <w:tcW w:w="2219" w:type="dxa"/>
+          </w:tcPr>
+          <w:p>
+            <w:pPr>
+              <w:spacing w:before="0" w:after="0"/>
+              <w:jc w:val="right"/>
+            </w:pPr>
+            <w:r>
+              <w:rPr>
+                <w:sz w:val="17"/>
+                <w:szCs w:val="17"/>
+              </w:rPr>
+              <w:t xml:space="preserve">$79.00</w:t>
+            </w:r>
+          </w:p>
+        </w:tc>
+      </w:tr>
+      <w:tr>
+        <w:trPr>
+          <w:cantSplit/>
+        </w:trPr>
+        <w:tc>
+          <w:tcPr>
+            <w:tcW w:w="4636" w:type="dxa"/>
+            <w:shd w:val="clear" w:color="auto" w:fill="F5F7FA"/>
+          </w:tcPr>
+          <w:p>
+            <w:pPr>
+              <w:spacing w:before="0" w:after="0"/>
+              <w:jc w:val="left"/>
+            </w:pPr>
+            <w:r>
+              <w:rPr>
+                <w:sz w:val="17"/>
+                <w:szCs w:val="17"/>
+              </w:rPr>
+              <w:t xml:space="preserve">PPC Plumbing</w:t>
+            </w:r>
+          </w:p>
+        </w:tc>
+        <w:tc>
+          <w:tcPr>
+            <w:tcW w:w="1814" w:type="dxa"/>
+            <w:shd w:val="clear" w:color="auto" w:fill="F5F7FA"/>
+          </w:tcPr>
+          <w:p>
+            <w:pPr>
+              <w:spacing w:before="0" w:after="0"/>
+              <w:jc w:val="right"/>
+            </w:pPr>
+            <w:r>
+              <w:rPr>
+                <w:sz w:val="17"/>
+                <w:szCs w:val="17"/>
+              </w:rPr>
+              <w:t xml:space="preserve">$0.00</w:t>
+            </w:r>
+          </w:p>
+        </w:tc>
+        <w:tc>
+          <w:tcPr>
+            <w:tcW w:w="1411" w:type="dxa"/>
+            <w:shd w:val="clear" w:color="auto" w:fill="F5F7FA"/>
+          </w:tcPr>
+          <w:p>
+            <w:pPr>
+              <w:spacing w:before="0" w:after="0"/>
+              <w:jc w:val="right"/>
+            </w:pPr>
+            <w:r>
+              <w:rPr>
+                <w:sz w:val="17"/>
+                <w:szCs w:val="17"/>
+              </w:rPr>
+              <w:t xml:space="preserve">2</w:t>
+            </w:r>
+          </w:p>
+        </w:tc>
+        <w:tc>
+          <w:tcPr>
+            <w:tcW w:w="2219" w:type="dxa"/>
+            <w:shd w:val="clear" w:color="auto" w:fill="F5F7FA"/>
+          </w:tcPr>
+          <w:p>
+            <w:pPr>
+              <w:spacing w:before="0" w:after="0"/>
+              <w:jc w:val="right"/>
+            </w:pPr>
+            <w:r>
+              <w:rPr>
+                <w:sz w:val="17"/>
+                <w:szCs w:val="17"/>
+              </w:rPr>
+              <w:t xml:space="preserve">$0.00</w:t>
+            </w:r>
+          </w:p>
+        </w:tc>
+      </w:tr>
+      <w:tr>
+        <w:trPr>
+          <w:cantSplit/>
+        </w:trPr>
+        <w:tc>
+          <w:tcPr>
+            <w:tcW w:w="4636" w:type="dxa"/>
+          </w:tcPr>
+          <w:p>
+            <w:pPr>
+              <w:spacing w:before="0" w:after="0"/>
+              <w:jc w:val="left"/>
+            </w:pPr>
+            <w:r>
+              <w:rPr>
+                <w:sz w:val="17"/>
+                <w:szCs w:val="17"/>
+              </w:rPr>
+              <w:t xml:space="preserve">Google Ads Pending Validation</w:t>
+            </w:r>
+          </w:p>
+        </w:tc>
+        <w:tc>
+          <w:tcPr>
+            <w:tcW w:w="1814" w:type="dxa"/>
+          </w:tcPr>
+          <w:p>
+            <w:pPr>
+              <w:spacing w:before="0" w:after="0"/>
+              <w:jc w:val="right"/>
+            </w:pPr>
+            <w:r>
+              <w:rPr>
+                <w:sz w:val="17"/>
+                <w:szCs w:val="17"/>
+              </w:rPr>
+              <w:t xml:space="preserve">$0.00</w:t>
+            </w:r>
+          </w:p>
+        </w:tc>
+        <w:tc>
+          <w:tcPr>
+            <w:tcW w:w="1411" w:type="dxa"/>
+          </w:tcPr>
+          <w:p>
+            <w:pPr>
+              <w:spacing w:before="0" w:after="0"/>
+              <w:jc w:val="right"/>
+            </w:pPr>
+            <w:r>
+              <w:rPr>
+                <w:sz w:val="17"/>
+                <w:szCs w:val="17"/>
+              </w:rPr>
+              <w:t xml:space="preserve">1</w:t>
+            </w:r>
+          </w:p>
+        </w:tc>
+        <w:tc>
+          <w:tcPr>
+            <w:tcW w:w="2219" w:type="dxa"/>
+          </w:tcPr>
+          <w:p>
+            <w:pPr>
+              <w:spacing w:before="0" w:after="0"/>
+              <w:jc w:val="right"/>
+            </w:pPr>
+            <w:r>
+              <w:rPr>
+                <w:sz w:val="17"/>
+                <w:szCs w:val="17"/>
+              </w:rPr>
+              <w:t xml:space="preserve">$79.00</w:t>
+            </w:r>
+          </w:p>
+        </w:tc>
+      </w:tr>
+      <w:tr>
+        <w:trPr>
+          <w:cantSplit/>
+        </w:trPr>
+        <w:tc>
+          <w:tcPr>
+            <w:tcW w:w="4636" w:type="dxa"/>
+            <w:shd w:val="clear" w:color="auto" w:fill="F5F7FA"/>
+          </w:tcPr>
+          <w:p>
+            <w:pPr>
+              <w:spacing w:before="0" w:after="0"/>
+              <w:jc w:val="left"/>
+            </w:pPr>
+            <w:r>
+              <w:rPr>
+                <w:sz w:val="17"/>
+                <w:szCs w:val="17"/>
+              </w:rPr>
+              <w:t xml:space="preserve">PPC Google Brand</w:t>
+            </w:r>
+          </w:p>
+        </w:tc>
+        <w:tc>
+          <w:tcPr>
+            <w:tcW w:w="1814" w:type="dxa"/>
+            <w:shd w:val="clear" w:color="auto" w:fill="F5F7FA"/>
+          </w:tcPr>
+          <w:p>
+            <w:pPr>
+              <w:spacing w:before="0" w:after="0"/>
+              <w:jc w:val="right"/>
+            </w:pPr>
+            <w:r>
+              <w:rPr>
+                <w:sz w:val="17"/>
+                <w:szCs w:val="17"/>
+              </w:rPr>
+              <w:t xml:space="preserve">$0.00</w:t>
+            </w:r>
+          </w:p>
+        </w:tc>
+        <w:tc>
+          <w:tcPr>
+            <w:tcW w:w="1411" w:type="dxa"/>
+            <w:shd w:val="clear" w:color="auto" w:fill="F5F7FA"/>
+          </w:tcPr>
+          <w:p>
+            <w:pPr>
+              <w:spacing w:before="0" w:after="0"/>
+              <w:jc w:val="right"/>
+            </w:pPr>
+            <w:r>
+              <w:rPr>
+                <w:sz w:val="17"/>
+                <w:szCs w:val="17"/>
+              </w:rPr>
+              <w:t xml:space="preserve">1</w:t>
+            </w:r>
+          </w:p>
+        </w:tc>
+        <w:tc>
+          <w:tcPr>
+            <w:tcW w:w="2219" w:type="dxa"/>
+            <w:shd w:val="clear" w:color="auto" w:fill="F5F7FA"/>
+          </w:tcPr>
+          <w:p>
+            <w:pPr>
+              <w:spacing w:before="0" w:after="0"/>
+              <w:jc w:val="right"/>
+            </w:pPr>
+            <w:r>
+              <w:rPr>
+                <w:sz w:val="17"/>
+                <w:szCs w:val="17"/>
+              </w:rPr>
+              <w:t xml:space="preserve">$0.00</w:t>
+            </w:r>
+          </w:p>
+        </w:tc>
+      </w:tr>
+    </w:tbl>
+    <w:p>
+      <w:pPr>
+        <w:spacing w:before="0" w:after="60"/>
+      </w:pPr>
+    </w:p>
+    <w:p>
+      <w:pPr>
         <w:pStyle w:val="Heading1"/>
         <w:keepNext/>
         <w:pageBreakBefore/>

</xml_diff>